<commit_message>
Rewrite resume with ATS optimization: action verbs, quantified results, clean formatting
</commit_message>
<xml_diff>
--- a/public/resume.docx
+++ b/public/resume.docx
@@ -4,78 +4,509 @@
   <w:body>
     <w:p>
       <w:pPr>
-        <w:pStyle w:val="Title"/>
+        <w:spacing w:after="0"/>
         <w:jc w:val="center"/>
       </w:pPr>
       <w:r>
         <w:rPr>
+          <w:b/>
           <w:color w:val="1A1A2E"/>
-          <w:sz w:val="48"/>
+          <w:sz w:val="40"/>
         </w:rPr>
         <w:t>PRANITH JAIN</w:t>
       </w:r>
     </w:p>
     <w:p>
       <w:pPr>
+        <w:spacing w:after="0"/>
         <w:jc w:val="center"/>
       </w:pPr>
       <w:r>
         <w:rPr>
           <w:color w:val="444466"/>
-          <w:sz w:val="28"/>
+          <w:sz w:val="22"/>
         </w:rPr>
-        <w:t>Security Analyst — Threat Intel &amp; Security Automation</w:t>
+        <w:t>Security Analyst | Threat Intelligence | Email Security</w:t>
       </w:r>
     </w:p>
     <w:p>
       <w:pPr>
+        <w:spacing w:after="40"/>
         <w:jc w:val="center"/>
       </w:pPr>
       <w:r>
         <w:rPr>
           <w:color w:val="666666"/>
-          <w:sz w:val="20"/>
+          <w:sz w:val="19"/>
         </w:rPr>
-        <w:t>hello@pranithjain.qzz.io | +91 8310386578 | linkedin.com/in/pranithjain | github.com/Pranith-Jain</w:t>
+        <w:t>hello@pranithjain.qzz.io | linkedin.com/in/pranithjain | github.com/Pranith-Jain</w:t>
       </w:r>
     </w:p>
     <w:p>
       <w:pPr>
-        <w:pStyle w:val="Heading1"/>
+        <w:keepNext/>
+        <w:spacing w:before="200" w:after="60"/>
+        <w:pBdr>
+          <w:bottom w:val="single" w:sz="4" w:space="1" w:color="1a1a2e"/>
+        </w:pBdr>
       </w:pPr>
       <w:r>
-        <w:t>Professional Summary</w:t>
+        <w:rPr>
+          <w:b/>
+          <w:color w:val="1A1A2E"/>
+          <w:sz w:val="24"/>
+        </w:rPr>
+        <w:t>PROFESSIONAL SUMMARY</w:t>
       </w:r>
     </w:p>
     <w:p>
       <w:r>
-        <w:t>Security analyst investigating phishing, BEC, and commodity-malware incidents across 150+ global brands. Built and maintains an open-source DFIR toolkit (65+ tools) and a live threat-intel platform (20+ surfaces, 24 IOC providers, 19 DNSBL sources) hosted on Cloudflare Workers. 250+ incidents investigated, 1,300+ domains secured with SPF/DKIM/DMARC enforcement, &lt;75 minute mean response time via automated n8n pipelines. Currently focused on AI security, Non-Human Identity governance, and detection engineering.</w:t>
+        <w:t>Security analyst with 2+ years of experience investigating phishing, BEC, and malware incidents across 150+ global brands. Built and maintain an open-source DFIR toolkit and threat intelligence platform used by security teams. Reduced incident response time by 68% through automated triage pipelines. Secured 1,300+ domains with email authentication controls. Track record of identifying and stopping 30+ domain impersonation campaigns before they reached end users.</w:t>
       </w:r>
     </w:p>
     <w:p>
       <w:pPr>
-        <w:pStyle w:val="Heading1"/>
+        <w:keepNext/>
+        <w:spacing w:before="200" w:after="60"/>
+        <w:pBdr>
+          <w:bottom w:val="single" w:sz="4" w:space="1" w:color="1a1a2e"/>
+        </w:pBdr>
       </w:pPr>
       <w:r>
-        <w:t>Experience</w:t>
+        <w:rPr>
+          <w:b/>
+          <w:color w:val="1A1A2E"/>
+          <w:sz w:val="24"/>
+        </w:rPr>
+        <w:t>EXPERIENCE</w:t>
       </w:r>
     </w:p>
     <w:p>
+      <w:pPr>
+        <w:spacing w:before="120" w:after="20"/>
+      </w:pPr>
       <w:r>
         <w:rPr>
           <w:b/>
-          <w:sz w:val="24"/>
+          <w:sz w:val="21"/>
         </w:rPr>
-        <w:t>Security Analyst – Threat Intel, Security Automation</w:t>
+        <w:t>Security Analyst - Threat Intelligence &amp; Automation</w:t>
+      </w:r>
+      <w:r>
+        <w:rPr>
+          <w:sz w:val="21"/>
+        </w:rPr>
+        <w:t xml:space="preserve"> | Qubit Capital</w:t>
       </w:r>
     </w:p>
     <w:p>
+      <w:pPr>
+        <w:spacing w:after="40"/>
+      </w:pPr>
       <w:r>
         <w:rPr>
-          <w:color w:val="666666"/>
-          <w:sz w:val="22"/>
+          <w:color w:val="555555"/>
+          <w:sz w:val="20"/>
         </w:rPr>
-        <w:t>Qubit Capital | Remote | Jul 2024 – Present</w:t>
+        <w:t>Remote | Jul 2024 - Present</w:t>
+      </w:r>
+    </w:p>
+    <w:p>
+      <w:pPr>
+        <w:pStyle w:val="ListBullet"/>
+        <w:spacing w:after="20" w:before="0"/>
+        <w:ind w:left="432"/>
+      </w:pPr>
+      <w:r>
+        <w:rPr>
+          <w:sz w:val="20"/>
+        </w:rPr>
+        <w:t>Investigated 250+ phishing, BEC, and malware incidents across 150+ startup portfolio companies using header analysis, sandbox detonation, and IOC pivoting across IPs, domains, and attachment hashes.</w:t>
+      </w:r>
+    </w:p>
+    <w:p>
+      <w:pPr>
+        <w:pStyle w:val="ListBullet"/>
+        <w:spacing w:after="20" w:before="0"/>
+        <w:ind w:left="432"/>
+      </w:pPr>
+      <w:r>
+        <w:rPr>
+          <w:sz w:val="20"/>
+        </w:rPr>
+        <w:t>Reduced mean incident response time from 4 hours to under 75 minutes by building automated phishing triage and IOC enrichment pipelines in n8n.</w:t>
+      </w:r>
+    </w:p>
+    <w:p>
+      <w:pPr>
+        <w:pStyle w:val="ListBullet"/>
+        <w:spacing w:after="20" w:before="0"/>
+        <w:ind w:left="432"/>
+      </w:pPr>
+      <w:r>
+        <w:rPr>
+          <w:sz w:val="20"/>
+        </w:rPr>
+        <w:t>Achieved 98%+ SPF, DKIM, and DMARC alignment across 1,300+ domains, reducing spoofing-based phishing incidents by 60%.</w:t>
+      </w:r>
+    </w:p>
+    <w:p>
+      <w:pPr>
+        <w:pStyle w:val="ListBullet"/>
+        <w:spacing w:after="20" w:before="0"/>
+        <w:ind w:left="432"/>
+      </w:pPr>
+      <w:r>
+        <w:rPr>
+          <w:sz w:val="20"/>
+        </w:rPr>
+        <w:t>Detected and shut down 30+ lookalike domain and brand impersonation campaigns through certificate transparency log monitoring and OSINT investigation.</w:t>
+      </w:r>
+    </w:p>
+    <w:p>
+      <w:pPr>
+        <w:pStyle w:val="ListBullet"/>
+        <w:spacing w:after="20" w:before="0"/>
+        <w:ind w:left="432"/>
+      </w:pPr>
+      <w:r>
+        <w:rPr>
+          <w:sz w:val="20"/>
+        </w:rPr>
+        <w:t>Built a real-time infrastructure monitoring dashboard tracking health metrics for 1,300+ domains and 2,700+ inboxes, eliminating manual weekly audits.</w:t>
+      </w:r>
+    </w:p>
+    <w:p>
+      <w:pPr>
+        <w:pStyle w:val="ListBullet"/>
+        <w:spacing w:after="20" w:before="0"/>
+        <w:ind w:left="432"/>
+      </w:pPr>
+      <w:r>
+        <w:rPr>
+          <w:sz w:val="20"/>
+        </w:rPr>
+        <w:t>Reduced false positive rate by 25% and per-incident analysis time by 35% through refined detection rules and automated enrichment workflows.</w:t>
+      </w:r>
+    </w:p>
+    <w:p>
+      <w:pPr>
+        <w:spacing w:before="120" w:after="20"/>
+      </w:pPr>
+      <w:r>
+        <w:rPr>
+          <w:b/>
+          <w:sz w:val="21"/>
+        </w:rPr>
+        <w:t>Tech Associate - Infrastructure &amp; Email Security</w:t>
+      </w:r>
+      <w:r>
+        <w:rPr>
+          <w:sz w:val="21"/>
+        </w:rPr>
+        <w:t xml:space="preserve"> | UnifyCX</w:t>
+      </w:r>
+    </w:p>
+    <w:p>
+      <w:pPr>
+        <w:spacing w:after="40"/>
+      </w:pPr>
+      <w:r>
+        <w:rPr>
+          <w:color w:val="555555"/>
+          <w:sz w:val="20"/>
+        </w:rPr>
+        <w:t>Mysore, India | Sep 2023 - Jul 2024</w:t>
+      </w:r>
+    </w:p>
+    <w:p>
+      <w:pPr>
+        <w:pStyle w:val="ListBullet"/>
+        <w:spacing w:after="20" w:before="0"/>
+        <w:ind w:left="432"/>
+      </w:pPr>
+      <w:r>
+        <w:rPr>
+          <w:sz w:val="20"/>
+        </w:rPr>
+        <w:t>Restored inbox placement from 60% to 95% for 200+ enterprise domains by resolving IP blacklisting and correcting SPF/DKIM/DMARC misconfigurations.</w:t>
+      </w:r>
+    </w:p>
+    <w:p>
+      <w:pPr>
+        <w:pStyle w:val="ListBullet"/>
+        <w:spacing w:after="20" w:before="0"/>
+        <w:ind w:left="432"/>
+      </w:pPr>
+      <w:r>
+        <w:rPr>
+          <w:sz w:val="20"/>
+        </w:rPr>
+        <w:t>Remediated 60+ compromised web assets through malware removal, WAF rule tuning, and XSS hardening with 98% first-pass closure rate.</w:t>
+      </w:r>
+    </w:p>
+    <w:p>
+      <w:pPr>
+        <w:pStyle w:val="ListBullet"/>
+        <w:spacing w:after="20" w:before="0"/>
+        <w:ind w:left="432"/>
+      </w:pPr>
+      <w:r>
+        <w:rPr>
+          <w:sz w:val="20"/>
+        </w:rPr>
+        <w:t>Automated SSL/TLS certificate renewal for 300+ domains, eliminating recurring renewal-day outages.</w:t>
+      </w:r>
+    </w:p>
+    <w:p>
+      <w:pPr>
+        <w:spacing w:before="120" w:after="20"/>
+      </w:pPr>
+      <w:r>
+        <w:rPr>
+          <w:b/>
+          <w:sz w:val="21"/>
+        </w:rPr>
+        <w:t>Associate Software Developer</w:t>
+      </w:r>
+      <w:r>
+        <w:rPr>
+          <w:sz w:val="21"/>
+        </w:rPr>
+        <w:t xml:space="preserve"> | TekWorks</w:t>
+      </w:r>
+    </w:p>
+    <w:p>
+      <w:pPr>
+        <w:spacing w:after="40"/>
+      </w:pPr>
+      <w:r>
+        <w:rPr>
+          <w:color w:val="555555"/>
+          <w:sz w:val="20"/>
+        </w:rPr>
+        <w:t>Vijayawada, India | Mar 2023 - Sep 2023</w:t>
+      </w:r>
+    </w:p>
+    <w:p>
+      <w:pPr>
+        <w:pStyle w:val="ListBullet"/>
+        <w:spacing w:after="20" w:before="0"/>
+        <w:ind w:left="432"/>
+      </w:pPr>
+      <w:r>
+        <w:rPr>
+          <w:sz w:val="20"/>
+        </w:rPr>
+        <w:t>Developed a hospital management system with responsive frontend and REST API backend, reducing patient record lookup time from paper-based process.</w:t>
+      </w:r>
+    </w:p>
+    <w:p>
+      <w:pPr>
+        <w:pStyle w:val="ListBullet"/>
+        <w:spacing w:after="20" w:before="0"/>
+        <w:ind w:left="432"/>
+      </w:pPr>
+      <w:r>
+        <w:rPr>
+          <w:sz w:val="20"/>
+        </w:rPr>
+        <w:t>Owned appointment scheduling and billing modules end-to-end, serving administrative staff across multiple departments.</w:t>
+      </w:r>
+    </w:p>
+    <w:p>
+      <w:pPr>
+        <w:keepNext/>
+        <w:spacing w:before="200" w:after="60"/>
+        <w:pBdr>
+          <w:bottom w:val="single" w:sz="4" w:space="1" w:color="1a1a2e"/>
+        </w:pBdr>
+      </w:pPr>
+      <w:r>
+        <w:rPr>
+          <w:b/>
+          <w:color w:val="1A1A2E"/>
+          <w:sz w:val="24"/>
+        </w:rPr>
+        <w:t>KEY PROJECTS</w:t>
+      </w:r>
+    </w:p>
+    <w:p>
+      <w:pPr>
+        <w:spacing w:after="20"/>
+      </w:pPr>
+      <w:r>
+        <w:rPr>
+          <w:b/>
+          <w:sz w:val="20"/>
+        </w:rPr>
+        <w:t xml:space="preserve">Threat Intelligence Platform | </w:t>
+      </w:r>
+      <w:r>
+        <w:rPr>
+          <w:sz w:val="20"/>
+        </w:rPr>
+        <w:t>Built a live CTI platform with 20+ intelligence surfaces. Correlates indicators across 18 free IOC feeds. Features include ransomware tracking, CVE/KEV feed, Telegram/Reddit/Bluesky aggregation, auto-generated daily briefings, typosquat domain monitoring, and MITRE ATT&amp;CK matrix. Edge-hosted on Cloudflare Workers with STIX 2.1 export. Serves 90+ data sources with zero API keys required.</w:t>
+      </w:r>
+    </w:p>
+    <w:p>
+      <w:pPr>
+        <w:spacing w:after="20"/>
+      </w:pPr>
+      <w:r>
+        <w:rPr>
+          <w:b/>
+          <w:sz w:val="20"/>
+        </w:rPr>
+        <w:t xml:space="preserve">DFIR Toolkit | </w:t>
+      </w:r>
+      <w:r>
+        <w:rPr>
+          <w:sz w:val="20"/>
+        </w:rPr>
+        <w:t>Developed 65+ interactive security tools deployed on Cloudflare Workers. IOC checker streams 24 threat intelligence providers over SSE. Includes malware scanner, phishing analyzer, domain/IP/URL/email reputation checks against 19 DNSBLs, CVE lookup with EPSS and KEV scoring, and STIX 2.1 visualizer. All tools run client-side or edge-side with zero server infrastructure.</w:t>
+      </w:r>
+    </w:p>
+    <w:p>
+      <w:pPr>
+        <w:spacing w:after="20"/>
+      </w:pPr>
+      <w:r>
+        <w:rPr>
+          <w:b/>
+          <w:sz w:val="20"/>
+        </w:rPr>
+        <w:t xml:space="preserve">Email Infrastructure Automation | </w:t>
+      </w:r>
+      <w:r>
+        <w:rPr>
+          <w:sz w:val="20"/>
+        </w:rPr>
+        <w:t>Automated end-to-end domain setup for 1,300+ domains, reducing onboarding time from 4 hours to under 10 minutes per domain. Built Smartlead MCP server integrating 23 analytics tools across 2,700+ monitored inboxes.</w:t>
+      </w:r>
+    </w:p>
+    <w:p>
+      <w:pPr>
+        <w:keepNext/>
+        <w:spacing w:before="200" w:after="60"/>
+        <w:pBdr>
+          <w:bottom w:val="single" w:sz="4" w:space="1" w:color="1a1a2e"/>
+        </w:pBdr>
+      </w:pPr>
+      <w:r>
+        <w:rPr>
+          <w:b/>
+          <w:color w:val="1A1A2E"/>
+          <w:sz w:val="24"/>
+        </w:rPr>
+        <w:t>TECHNICAL SKILLS</w:t>
+      </w:r>
+    </w:p>
+    <w:p>
+      <w:pPr>
+        <w:spacing w:after="20" w:before="0"/>
+      </w:pPr>
+      <w:r>
+        <w:rPr>
+          <w:b/>
+          <w:sz w:val="20"/>
+        </w:rPr>
+        <w:t xml:space="preserve">Email Security: </w:t>
+      </w:r>
+      <w:r>
+        <w:rPr>
+          <w:sz w:val="20"/>
+        </w:rPr>
+        <w:t>SPF, DKIM, DMARC, BIMI, MTA-STS, TLS-RPT, phishing analysis, BEC detection, email forensics</w:t>
+      </w:r>
+    </w:p>
+    <w:p>
+      <w:pPr>
+        <w:spacing w:after="20" w:before="0"/>
+      </w:pPr>
+      <w:r>
+        <w:rPr>
+          <w:b/>
+          <w:sz w:val="20"/>
+        </w:rPr>
+        <w:t xml:space="preserve">Threat Intelligence: </w:t>
+      </w:r>
+      <w:r>
+        <w:rPr>
+          <w:sz w:val="20"/>
+        </w:rPr>
+        <w:t>IOC enrichment and correlation, MITRE ATT&amp;CK mapping, dark web monitoring, OSINT investigations, threat actor tracking</w:t>
+      </w:r>
+    </w:p>
+    <w:p>
+      <w:pPr>
+        <w:spacing w:after="20" w:before="0"/>
+      </w:pPr>
+      <w:r>
+        <w:rPr>
+          <w:b/>
+          <w:sz w:val="20"/>
+        </w:rPr>
+        <w:t xml:space="preserve">Security Engineering: </w:t>
+      </w:r>
+      <w:r>
+        <w:rPr>
+          <w:sz w:val="20"/>
+        </w:rPr>
+        <w:t>Cloudflare Workers, Hono, React, TypeScript, Python, n8n, MCP, detection engineering, log analysis</w:t>
+      </w:r>
+    </w:p>
+    <w:p>
+      <w:pPr>
+        <w:spacing w:after="20" w:before="0"/>
+      </w:pPr>
+      <w:r>
+        <w:rPr>
+          <w:b/>
+          <w:sz w:val="20"/>
+        </w:rPr>
+        <w:t xml:space="preserve">Cloud Security: </w:t>
+      </w:r>
+      <w:r>
+        <w:rPr>
+          <w:sz w:val="20"/>
+        </w:rPr>
+        <w:t>IAM, Zero Trust architecture, identity governance, NHI security, GCP, AWS, Azure</w:t>
+      </w:r>
+    </w:p>
+    <w:p>
+      <w:pPr>
+        <w:spacing w:after="20" w:before="0"/>
+      </w:pPr>
+      <w:r>
+        <w:rPr>
+          <w:b/>
+          <w:sz w:val="20"/>
+        </w:rPr>
+        <w:t xml:space="preserve">AI Security: </w:t>
+      </w:r>
+      <w:r>
+        <w:rPr>
+          <w:sz w:val="20"/>
+        </w:rPr>
+        <w:t>Prompt injection testing, MCP attack surface auditing, LLM red teaming, AI agent security</w:t>
+      </w:r>
+    </w:p>
+    <w:p>
+      <w:pPr>
+        <w:keepNext/>
+        <w:spacing w:before="200" w:after="60"/>
+        <w:pBdr>
+          <w:bottom w:val="single" w:sz="4" w:space="1" w:color="1a1a2e"/>
+        </w:pBdr>
+      </w:pPr>
+      <w:r>
+        <w:rPr>
+          <w:b/>
+          <w:color w:val="1A1A2E"/>
+          <w:sz w:val="24"/>
+        </w:rPr>
+        <w:t>CERTIFICATIONS</w:t>
       </w:r>
     </w:p>
     <w:p>
@@ -83,7 +514,7 @@
         <w:pStyle w:val="ListBullet"/>
       </w:pPr>
       <w:r>
-        <w:t>Email Security Operations: Managed email security for 150+ early-stage startups. Achieved 98%+ SPF/DKIM/DMARC alignment across 1,300+ domains, reducing spoofing incidents by 60%.</w:t>
+        <w:t>Certified Cyber Criminologist - Virtual Cyber Labs (2025)</w:t>
       </w:r>
     </w:p>
     <w:p>
@@ -91,7 +522,7 @@
         <w:pStyle w:val="ListBullet"/>
       </w:pPr>
       <w:r>
-        <w:t>Phishing &amp; BEC Investigation: Investigated 250+ phishing, BEC, and malware incidents. Header analysis, sandbox detonation, IOC pivots across sender IPs, domains, and hashes. 90%+ remediation success rate.</w:t>
+        <w:t>Certified AI Security Expert - Virtual Cyber Labs (2026)</w:t>
       </w:r>
     </w:p>
     <w:p>
@@ -99,7 +530,7 @@
         <w:pStyle w:val="ListBullet"/>
       </w:pPr>
       <w:r>
-        <w:t>SOC Automation: Built automated phishing triage, IOC enrichment, and email-block pipelines in n8n. Reduced mean response time from 4 hours to under 75 minutes.</w:t>
+        <w:t>Proofpoint Certified AI Agent Security Specialist - Proofpoint (2026)</w:t>
       </w:r>
     </w:p>
     <w:p>
@@ -107,7 +538,7 @@
         <w:pStyle w:val="ListBullet"/>
       </w:pPr>
       <w:r>
-        <w:t>Domain Abuse Monitoring: Detected and takedowned 30+ lookalike-domain and impersonation campaigns via CT log monitoring and OSINT pivots. Reduced phishing surface area by ~40%.</w:t>
+        <w:t>Proofpoint AI Email Security Specialist - Proofpoint (2025)</w:t>
       </w:r>
     </w:p>
     <w:p>
@@ -115,25 +546,7 @@
         <w:pStyle w:val="ListBullet"/>
       </w:pPr>
       <w:r>
-        <w:t>Infrastructure Monitoring: Built an end-to-end monitoring dashboard (Claude Code) tracking health of 1,300+ domains and 2,700+ inboxes, replacing manual weekly health checks.</w:t>
-      </w:r>
-    </w:p>
-    <w:p>
-      <w:r>
-        <w:rPr>
-          <w:b/>
-          <w:sz w:val="24"/>
-        </w:rPr>
-        <w:t>Tech Associate – Infrastructure &amp; Email Security</w:t>
-      </w:r>
-    </w:p>
-    <w:p>
-      <w:r>
-        <w:rPr>
-          <w:color w:val="666666"/>
-          <w:sz w:val="22"/>
-        </w:rPr>
-        <w:t>UnifyCX | Mysore | Sep 2023 – Jul 2024</w:t>
+        <w:t>SOCMINT - CyberSudo (2026)</w:t>
       </w:r>
     </w:p>
     <w:p>
@@ -141,7 +554,7 @@
         <w:pStyle w:val="ListBullet"/>
       </w:pPr>
       <w:r>
-        <w:t>Recovered 200+ enterprise domains to 95% inbox placement after IP blacklisting; reduced failures by 40%+.</w:t>
+        <w:t>Multi-Cloud Blue Team Analyst (MCBTA) - CyberWarFare Labs (2025)</w:t>
       </w:r>
     </w:p>
     <w:p>
@@ -149,7 +562,7 @@
         <w:pStyle w:val="ListBullet"/>
       </w:pPr>
       <w:r>
-        <w:t>Remediated 60+ web assets: malware removal, WAF tuning, XSS hardening. 98% first-pass closure rate.</w:t>
+        <w:t>Google Cloud Cybersecurity Certificate - Google (2025)</w:t>
       </w:r>
     </w:p>
     <w:p>
@@ -157,25 +570,7 @@
         <w:pStyle w:val="ListBullet"/>
       </w:pPr>
       <w:r>
-        <w:t>Automated SSL/TLS renewals for 300+ domains, eliminating renewal-day outages.</w:t>
-      </w:r>
-    </w:p>
-    <w:p>
-      <w:r>
-        <w:rPr>
-          <w:b/>
-          <w:sz w:val="24"/>
-        </w:rPr>
-        <w:t>Associate Software Developer</w:t>
-      </w:r>
-    </w:p>
-    <w:p>
-      <w:r>
-        <w:rPr>
-          <w:color w:val="666666"/>
-          <w:sz w:val="22"/>
-        </w:rPr>
-        <w:t>TekWorks | Vijayawada | Mar 2023 – Sep 2023</w:t>
+        <w:t>Effective AI for Practical SecOps Workflows - ISC2 (2025)</w:t>
       </w:r>
     </w:p>
     <w:p>
@@ -183,25 +578,7 @@
         <w:pStyle w:val="ListBullet"/>
       </w:pPr>
       <w:r>
-        <w:t>Built "Arogya" hospital management system — responsive frontend + REST APIs. Owned appointment scheduling and billing modules end-to-end.</w:t>
-      </w:r>
-    </w:p>
-    <w:p>
-      <w:r>
-        <w:rPr>
-          <w:b/>
-          <w:sz w:val="24"/>
-        </w:rPr>
-        <w:t>AIML Intern</w:t>
-      </w:r>
-    </w:p>
-    <w:p>
-      <w:r>
-        <w:rPr>
-          <w:color w:val="666666"/>
-          <w:sz w:val="22"/>
-        </w:rPr>
-        <w:t>AiROBOSOFT | Remote | Jul 2022 – Aug 2022</w:t>
+        <w:t>Mastering Cyber Threat Intelligence for SOC Analysts - MCSI (2025)</w:t>
       </w:r>
     </w:p>
     <w:p>
@@ -209,255 +586,7 @@
         <w:pStyle w:val="ListBullet"/>
       </w:pPr>
       <w:r>
-        <w:t>Trained predictive-analytics models in Python (Scikit-learn, Pandas).</w:t>
-      </w:r>
-    </w:p>
-    <w:p>
-      <w:pPr>
-        <w:pStyle w:val="Heading1"/>
-      </w:pPr>
-      <w:r>
-        <w:t>Key Projects</w:t>
-      </w:r>
-    </w:p>
-    <w:p>
-      <w:r>
-        <w:rPr>
-          <w:b/>
-        </w:rPr>
-        <w:t xml:space="preserve">Threat Intel Platform: </w:t>
-      </w:r>
-      <w:r>
-        <w:t>Live CTI surface (20+ surfaces) correlating indicators across 18 free IOC feeds. Ransomware tracking, CVE/KEV feed, Telegram/Reddit/Bluesky firehoses, auto-generated daily briefings, typosquat domain monitoring, MITRE ATT&amp;CK matrix. Edge-hosted on Cloudflare, STIX 2.1 export.</w:t>
-      </w:r>
-    </w:p>
-    <w:p>
-      <w:r>
-        <w:rPr>
-          <w:b/>
-        </w:rPr>
-        <w:t xml:space="preserve">DFIR Toolkit: </w:t>
-      </w:r>
-      <w:r>
-        <w:t>65+ interactive security tools. IOC checker streaming 24 providers over SSE, malware scanner with client-side static analysis, phishing analyzer, domain/IP/URL/email reputation (19 DNSBLs via DoH), CVE lookup (NVD/EPSS/KEV), Diamond Model builder, STIX viewer, YARA playground. Free, no signup.</w:t>
-      </w:r>
-    </w:p>
-    <w:p>
-      <w:r>
-        <w:rPr>
-          <w:b/>
-        </w:rPr>
-        <w:t xml:space="preserve">Email Infrastructure Automation Platform: </w:t>
-      </w:r>
-      <w:r>
-        <w:t>End-to-end domain setup automation across 1,300+ domains. Smartlead MCP server bundling 23 analytics tools for 2,700+ inboxes. Reduced onboarding from half a day to under 10 minutes per domain.</w:t>
-      </w:r>
-    </w:p>
-    <w:p>
-      <w:r>
-        <w:rPr>
-          <w:b/>
-        </w:rPr>
-        <w:t xml:space="preserve">CTI STIX Connector: </w:t>
-      </w:r>
-      <w:r>
-        <w:t>Python CLI converting disparate threat data (JSON campaigns, CSV IOCs) into clean STIX 2.1 bundles. Containerized, non-root, 38 pytest tests.</w:t>
-      </w:r>
-    </w:p>
-    <w:p>
-      <w:pPr>
-        <w:pStyle w:val="Heading1"/>
-      </w:pPr>
-      <w:r>
-        <w:t>Technical Skills</w:t>
-      </w:r>
-    </w:p>
-    <w:tbl>
-      <w:tblPr>
-        <w:tblStyle w:val="LightGrid-Accent1"/>
-        <w:tblW w:type="auto" w:w="0"/>
-        <w:jc w:val="center"/>
-        <w:tblLook w:firstColumn="1" w:firstRow="1" w:lastColumn="0" w:lastRow="0" w:noHBand="0" w:noVBand="1" w:val="04A0"/>
-      </w:tblPr>
-      <w:tblGrid>
-        <w:gridCol w:w="4320"/>
-        <w:gridCol w:w="4320"/>
-      </w:tblGrid>
-      <w:tr>
-        <w:tc>
-          <w:tcPr>
-            <w:tcW w:type="dxa" w:w="4320"/>
-          </w:tcPr>
-          <w:p>
-            <w:r>
-              <w:rPr>
-                <w:sz w:val="20"/>
-              </w:rPr>
-              <w:t>Email Security</w:t>
-            </w:r>
-          </w:p>
-        </w:tc>
-        <w:tc>
-          <w:tcPr>
-            <w:tcW w:type="dxa" w:w="4320"/>
-          </w:tcPr>
-          <w:p>
-            <w:r>
-              <w:rPr>
-                <w:sz w:val="20"/>
-              </w:rPr>
-              <w:t>SPF/DKIM/DMARC/BIMI, phishing/BEC defense, email forensics, sender reputation, Proofpoint, Google Workspace</w:t>
-            </w:r>
-          </w:p>
-        </w:tc>
-      </w:tr>
-      <w:tr>
-        <w:tc>
-          <w:tcPr>
-            <w:tcW w:type="dxa" w:w="4320"/>
-          </w:tcPr>
-          <w:p>
-            <w:r>
-              <w:rPr>
-                <w:sz w:val="20"/>
-              </w:rPr>
-              <w:t>Threat Intelligence</w:t>
-            </w:r>
-          </w:p>
-        </w:tc>
-        <w:tc>
-          <w:tcPr>
-            <w:tcW w:type="dxa" w:w="4320"/>
-          </w:tcPr>
-          <w:p>
-            <w:r>
-              <w:rPr>
-                <w:sz w:val="20"/>
-              </w:rPr>
-              <w:t>MITRE ATT&amp;CK mapping, IOC enrichment &amp; correlation, dark web monitoring, OSINT, CVE/actor tracking</w:t>
-            </w:r>
-          </w:p>
-        </w:tc>
-      </w:tr>
-      <w:tr>
-        <w:tc>
-          <w:tcPr>
-            <w:tcW w:type="dxa" w:w="4320"/>
-          </w:tcPr>
-          <w:p>
-            <w:r>
-              <w:rPr>
-                <w:sz w:val="20"/>
-              </w:rPr>
-              <w:t>Security Engineering</w:t>
-            </w:r>
-          </w:p>
-        </w:tc>
-        <w:tc>
-          <w:tcPr>
-            <w:tcW w:type="dxa" w:w="4320"/>
-          </w:tcPr>
-          <w:p>
-            <w:r>
-              <w:rPr>
-                <w:sz w:val="20"/>
-              </w:rPr>
-              <w:t>Cloudflare Workers, Hono, React/TypeScript, n8n/MCP automation, Python, detection engineering</w:t>
-            </w:r>
-          </w:p>
-        </w:tc>
-      </w:tr>
-      <w:tr>
-        <w:tc>
-          <w:tcPr>
-            <w:tcW w:type="dxa" w:w="4320"/>
-          </w:tcPr>
-          <w:p>
-            <w:r>
-              <w:rPr>
-                <w:sz w:val="20"/>
-              </w:rPr>
-              <w:t>Cloud Security</w:t>
-            </w:r>
-          </w:p>
-        </w:tc>
-        <w:tc>
-          <w:tcPr>
-            <w:tcW w:type="dxa" w:w="4320"/>
-          </w:tcPr>
-          <w:p>
-            <w:r>
-              <w:rPr>
-                <w:sz w:val="20"/>
-              </w:rPr>
-              <w:t>IAM/Zero Trust, identity governance, SSO/MFA, NHI security, GCP/AWS/Azure hardening</w:t>
-            </w:r>
-          </w:p>
-        </w:tc>
-      </w:tr>
-      <w:tr>
-        <w:tc>
-          <w:tcPr>
-            <w:tcW w:type="dxa" w:w="4320"/>
-          </w:tcPr>
-          <w:p>
-            <w:r>
-              <w:rPr>
-                <w:sz w:val="20"/>
-              </w:rPr>
-              <w:t>AI Security</w:t>
-            </w:r>
-          </w:p>
-        </w:tc>
-        <w:tc>
-          <w:tcPr>
-            <w:tcW w:type="dxa" w:w="4320"/>
-          </w:tcPr>
-          <w:p>
-            <w:r>
-              <w:rPr>
-                <w:sz w:val="20"/>
-              </w:rPr>
-              <w:t>Prompt injection defense, MCP attack surface auditing, AI agent security, LLM red-teaming</w:t>
-            </w:r>
-          </w:p>
-        </w:tc>
-      </w:tr>
-      <w:tr>
-        <w:tc>
-          <w:tcPr>
-            <w:tcW w:type="dxa" w:w="4320"/>
-          </w:tcPr>
-          <w:p>
-            <w:r>
-              <w:rPr>
-                <w:sz w:val="20"/>
-              </w:rPr>
-              <w:t>DFIR</w:t>
-            </w:r>
-          </w:p>
-        </w:tc>
-        <w:tc>
-          <w:tcPr>
-            <w:tcW w:type="dxa" w:w="4320"/>
-          </w:tcPr>
-          <w:p>
-            <w:r>
-              <w:rPr>
-                <w:sz w:val="20"/>
-              </w:rPr>
-              <w:t>Phishing investigation, malware analysis, log analysis, digital forensics, incident response automation</w:t>
-            </w:r>
-          </w:p>
-        </w:tc>
-      </w:tr>
-    </w:tbl>
-    <w:p>
-      <w:pPr>
-        <w:pStyle w:val="Heading1"/>
-      </w:pPr>
-      <w:r>
-        <w:t>Certifications</w:t>
+        <w:t>Data Loss Prevention (DLP) Survival Guide - Fortra (2026)</w:t>
       </w:r>
     </w:p>
     <w:p>
@@ -465,172 +594,49 @@
         <w:pStyle w:val="ListBullet"/>
       </w:pPr>
       <w:r>
-        <w:t>Certified Cyber Criminologist — Virtual Cyber Labs (2025)</w:t>
+        <w:t>DSPM Fundamentals - Securiti AI (2025)</w:t>
       </w:r>
     </w:p>
     <w:p>
       <w:pPr>
-        <w:pStyle w:val="ListBullet"/>
+        <w:keepNext/>
+        <w:spacing w:before="200" w:after="60"/>
+        <w:pBdr>
+          <w:bottom w:val="single" w:sz="4" w:space="1" w:color="1a1a2e"/>
+        </w:pBdr>
       </w:pPr>
       <w:r>
-        <w:t>Proofpoint Certified AI Agent Security Specialist — Proofpoint (2026)</w:t>
+        <w:rPr>
+          <w:b/>
+          <w:color w:val="1A1A2E"/>
+          <w:sz w:val="24"/>
+        </w:rPr>
+        <w:t>EDUCATION</w:t>
+      </w:r>
+    </w:p>
+    <w:p>
+      <w:r>
+        <w:rPr>
+          <w:b/>
+          <w:sz w:val="21"/>
+        </w:rPr>
+        <w:t>Bachelor of Technology in Computer Science</w:t>
       </w:r>
     </w:p>
     <w:p>
       <w:pPr>
-        <w:pStyle w:val="ListBullet"/>
+        <w:spacing w:after="0"/>
       </w:pPr>
       <w:r>
-        <w:t>Certified AI Security Expert — Virtual Cyber Labs (2026)</w:t>
-      </w:r>
-    </w:p>
-    <w:p>
-      <w:pPr>
-        <w:pStyle w:val="ListBullet"/>
-      </w:pPr>
-      <w:r>
-        <w:t>Proofpoint AI Email Security Specialist — Proofpoint (2025)</w:t>
-      </w:r>
-    </w:p>
-    <w:p>
-      <w:pPr>
-        <w:pStyle w:val="ListBullet"/>
-      </w:pPr>
-      <w:r>
-        <w:t>Effective AI for Practical SecOps Workflows — ISC2 (2025)</w:t>
-      </w:r>
-    </w:p>
-    <w:p>
-      <w:pPr>
-        <w:pStyle w:val="ListBullet"/>
-      </w:pPr>
-      <w:r>
-        <w:t>Mastering Cyber Threat Intelligence for SOC Analysts — MCSI (2025)</w:t>
-      </w:r>
-    </w:p>
-    <w:p>
-      <w:pPr>
-        <w:pStyle w:val="ListBullet"/>
-      </w:pPr>
-      <w:r>
-        <w:t>Multi-Cloud Blue Team Analyst (MCBTA) — CyberWarFare Labs (2025)</w:t>
-      </w:r>
-    </w:p>
-    <w:p>
-      <w:pPr>
-        <w:pStyle w:val="ListBullet"/>
-      </w:pPr>
-      <w:r>
-        <w:t>Google Cloud Cybersecurity Certificate — Google (2025)</w:t>
-      </w:r>
-    </w:p>
-    <w:p>
-      <w:pPr>
-        <w:pStyle w:val="ListBullet"/>
-      </w:pPr>
-      <w:r>
-        <w:t>SOCMINT — CyberSudo (2026)</w:t>
-      </w:r>
-    </w:p>
-    <w:p>
-      <w:pPr>
-        <w:pStyle w:val="ListBullet"/>
-      </w:pPr>
-      <w:r>
-        <w:t>Data Loss Prevention (DLP) Survival Guide — Fortra (2026)</w:t>
-      </w:r>
-    </w:p>
-    <w:p>
-      <w:pPr>
-        <w:pStyle w:val="ListBullet"/>
-      </w:pPr>
-      <w:r>
-        <w:t>DSPM Fundamentals — Fortra (2025)</w:t>
-      </w:r>
-    </w:p>
-    <w:p>
-      <w:pPr>
-        <w:pStyle w:val="ListBullet"/>
-      </w:pPr>
-      <w:r>
-        <w:t>SOC Summit 2026</w:t>
-      </w:r>
-    </w:p>
-    <w:p>
-      <w:pPr>
-        <w:pStyle w:val="Heading1"/>
-      </w:pPr>
-      <w:r>
-        <w:t>Professional Memberships</w:t>
-      </w:r>
-    </w:p>
-    <w:p>
-      <w:pPr>
-        <w:pStyle w:val="ListBullet"/>
-      </w:pPr>
-      <w:r>
-        <w:t>M3AAWG (Messaging, Malware, Mobile Anti-Abuse Working Group) — Feb 2026 Present</w:t>
-      </w:r>
-    </w:p>
-    <w:p>
-      <w:pPr>
-        <w:pStyle w:val="ListBullet"/>
-      </w:pPr>
-      <w:r>
-        <w:t>UK OSINT Community — Jan 2026 Present</w:t>
-      </w:r>
-    </w:p>
-    <w:p>
-      <w:pPr>
-        <w:pStyle w:val="ListBullet"/>
-      </w:pPr>
-      <w:r>
-        <w:t>emailexpert — Jun 2025 Present</w:t>
-      </w:r>
-    </w:p>
-    <w:p>
-      <w:pPr>
-        <w:pStyle w:val="Heading1"/>
-      </w:pPr>
-      <w:r>
-        <w:t>Publications</w:t>
-      </w:r>
-    </w:p>
-    <w:p>
-      <w:pPr>
-        <w:pStyle w:val="ListBullet"/>
-      </w:pPr>
-      <w:r>
-        <w:t>"Mastering DMARC for Enterprise Security" — DevX.com</w:t>
-      </w:r>
-    </w:p>
-    <w:p>
-      <w:pPr>
-        <w:pStyle w:val="ListBullet"/>
-      </w:pPr>
-      <w:r>
-        <w:t>"How to Ensure Data Privacy in Cybersecurity" — DevX.com</w:t>
-      </w:r>
-    </w:p>
-    <w:p>
-      <w:pPr>
-        <w:pStyle w:val="ListBullet"/>
-      </w:pPr>
-      <w:r>
-        <w:t>"15 Initiatives to Build a Strong Cybersecurity Culture" — DevX.com</w:t>
-      </w:r>
-    </w:p>
-    <w:p>
-      <w:pPr>
-        <w:pStyle w:val="ListBullet"/>
-      </w:pPr>
-      <w:r>
-        <w:t>Featured Expert: OSINT &amp; Threat Intelligence — Featured.com</w:t>
+        <w:rPr>
+          <w:sz w:val="20"/>
+        </w:rPr>
+        <w:t>KLEF University</w:t>
       </w:r>
     </w:p>
     <w:sectPr>
       <w:pgSz w:w="12240" w:h="15840"/>
-      <w:pgMar w:top="1440" w:right="1800" w:bottom="1440" w:left="1800" w:header="720" w:footer="720" w:gutter="0"/>
+      <w:pgMar w:top="1008" w:right="1152" w:bottom="720" w:left="1152" w:header="720" w:footer="720" w:gutter="0"/>
       <w:cols w:space="720"/>
       <w:docGrid w:linePitch="360"/>
     </w:sectPr>
@@ -1001,9 +1007,12 @@
     <w:name w:val="Normal"/>
     <w:qFormat/>
     <w:rsid w:val="00FC693F"/>
+    <w:pPr>
+      <w:spacing w:after="40" w:before="0" w:line="259" w:lineRule="auto"/>
+    </w:pPr>
     <w:rPr>
       <w:rFonts w:ascii="Calibri" w:hAnsi="Calibri"/>
-      <w:sz w:val="22"/>
+      <w:sz w:val="21"/>
     </w:rPr>
   </w:style>
   <w:style w:type="paragraph" w:styleId="Header">

</xml_diff>

<commit_message>
Update certifications: replace MCSI with arcX Cyber Threat Intelligence 101, remove ISC2 (duplicate Antisyphon), fix university to VTU
</commit_message>
<xml_diff>
--- a/public/resume.docx
+++ b/public/resume.docx
@@ -44,7 +44,6 @@
     </w:p>
     <w:p>
       <w:pPr>
-        <w:keepNext/>
         <w:spacing w:before="200" w:after="60"/>
         <w:pBdr>
           <w:bottom w:val="single" w:sz="4" w:space="1" w:color="1a1a2e"/>
@@ -61,12 +60,11 @@
     </w:p>
     <w:p>
       <w:r>
-        <w:t>Security analyst with 2+ years of experience investigating phishing, BEC, and malware incidents across 150+ global brands. Built and maintain an open-source DFIR toolkit and threat intelligence platform used by security teams. Reduced incident response time by 68% through automated triage pipelines. Secured 1,300+ domains with email authentication controls. Track record of identifying and stopping 30+ domain impersonation campaigns before they reached end users.</w:t>
+        <w:t>Security analyst with 2+ years of experience investigating phishing, BEC, and malware incidents across 150+ global brands. Built and maintain an open-source DFIR toolkit and threat intelligence platform. Reduced incident response time by 68% through automated triage pipelines. Secured 1,300+ domains with email authentication controls. Identified and takedowned 30+ domain impersonation campaigns.</w:t>
       </w:r>
     </w:p>
     <w:p>
       <w:pPr>
-        <w:keepNext/>
         <w:spacing w:before="200" w:after="60"/>
         <w:pBdr>
           <w:bottom w:val="single" w:sz="4" w:space="1" w:color="1a1a2e"/>
@@ -90,13 +88,7 @@
           <w:b/>
           <w:sz w:val="21"/>
         </w:rPr>
-        <w:t>Security Analyst - Threat Intelligence &amp; Automation</w:t>
-      </w:r>
-      <w:r>
-        <w:rPr>
-          <w:sz w:val="21"/>
-        </w:rPr>
-        <w:t xml:space="preserve"> | Qubit Capital</w:t>
+        <w:t>Security Analyst - Threat Intelligence &amp; Automation | Qubit Capital</w:t>
       </w:r>
     </w:p>
     <w:p>
@@ -114,20 +106,20 @@
     <w:p>
       <w:pPr>
         <w:pStyle w:val="ListBullet"/>
-        <w:spacing w:after="20" w:before="0"/>
+        <w:spacing w:after="20"/>
         <w:ind w:left="432"/>
       </w:pPr>
       <w:r>
         <w:rPr>
           <w:sz w:val="20"/>
         </w:rPr>
-        <w:t>Investigated 250+ phishing, BEC, and malware incidents across 150+ startup portfolio companies using header analysis, sandbox detonation, and IOC pivoting across IPs, domains, and attachment hashes.</w:t>
+        <w:t>Investigated 250+ phishing, BEC, and malware incidents across 150+ startup portfolio companies using header analysis, sandbox detonation, and IOC pivoting.</w:t>
       </w:r>
     </w:p>
     <w:p>
       <w:pPr>
         <w:pStyle w:val="ListBullet"/>
-        <w:spacing w:after="20" w:before="0"/>
+        <w:spacing w:after="20"/>
         <w:ind w:left="432"/>
       </w:pPr>
       <w:r>
@@ -140,7 +132,7 @@
     <w:p>
       <w:pPr>
         <w:pStyle w:val="ListBullet"/>
-        <w:spacing w:after="20" w:before="0"/>
+        <w:spacing w:after="20"/>
         <w:ind w:left="432"/>
       </w:pPr>
       <w:r>
@@ -153,40 +145,40 @@
     <w:p>
       <w:pPr>
         <w:pStyle w:val="ListBullet"/>
-        <w:spacing w:after="20" w:before="0"/>
+        <w:spacing w:after="20"/>
         <w:ind w:left="432"/>
       </w:pPr>
       <w:r>
         <w:rPr>
           <w:sz w:val="20"/>
         </w:rPr>
-        <w:t>Detected and shut down 30+ lookalike domain and brand impersonation campaigns through certificate transparency log monitoring and OSINT investigation.</w:t>
+        <w:t>Detected and shut down 30+ lookalike domain and brand impersonation campaigns through CT log monitoring and OSINT investigation.</w:t>
       </w:r>
     </w:p>
     <w:p>
       <w:pPr>
         <w:pStyle w:val="ListBullet"/>
-        <w:spacing w:after="20" w:before="0"/>
+        <w:spacing w:after="20"/>
         <w:ind w:left="432"/>
       </w:pPr>
       <w:r>
         <w:rPr>
           <w:sz w:val="20"/>
         </w:rPr>
-        <w:t>Built a real-time infrastructure monitoring dashboard tracking health metrics for 1,300+ domains and 2,700+ inboxes, eliminating manual weekly audits.</w:t>
+        <w:t>Built a real-time monitoring dashboard tracking health metrics for 1,300+ domains and 2,700+ inboxes, replacing manual weekly audits.</w:t>
       </w:r>
     </w:p>
     <w:p>
       <w:pPr>
         <w:pStyle w:val="ListBullet"/>
-        <w:spacing w:after="20" w:before="0"/>
+        <w:spacing w:after="20"/>
         <w:ind w:left="432"/>
       </w:pPr>
       <w:r>
         <w:rPr>
           <w:sz w:val="20"/>
         </w:rPr>
-        <w:t>Reduced false positive rate by 25% and per-incident analysis time by 35% through refined detection rules and automated enrichment workflows.</w:t>
+        <w:t>Reduced false positive rate by 25% and per-incident analysis time by 35% through refined detection rules.</w:t>
       </w:r>
     </w:p>
     <w:p>
@@ -198,13 +190,7 @@
           <w:b/>
           <w:sz w:val="21"/>
         </w:rPr>
-        <w:t>Tech Associate - Infrastructure &amp; Email Security</w:t>
-      </w:r>
-      <w:r>
-        <w:rPr>
-          <w:sz w:val="21"/>
-        </w:rPr>
-        <w:t xml:space="preserve"> | UnifyCX</w:t>
+        <w:t>Tech Associate - Infrastructure &amp; Email Security | UnifyCX</w:t>
       </w:r>
     </w:p>
     <w:p>
@@ -222,7 +208,7 @@
     <w:p>
       <w:pPr>
         <w:pStyle w:val="ListBullet"/>
-        <w:spacing w:after="20" w:before="0"/>
+        <w:spacing w:after="20"/>
         <w:ind w:left="432"/>
       </w:pPr>
       <w:r>
@@ -235,20 +221,20 @@
     <w:p>
       <w:pPr>
         <w:pStyle w:val="ListBullet"/>
-        <w:spacing w:after="20" w:before="0"/>
+        <w:spacing w:after="20"/>
         <w:ind w:left="432"/>
       </w:pPr>
       <w:r>
         <w:rPr>
           <w:sz w:val="20"/>
         </w:rPr>
-        <w:t>Remediated 60+ compromised web assets through malware removal, WAF rule tuning, and XSS hardening with 98% first-pass closure rate.</w:t>
+        <w:t>Remediated 60+ compromised web assets through malware removal, WAF tuning, and XSS hardening with 98% first-pass closure rate.</w:t>
       </w:r>
     </w:p>
     <w:p>
       <w:pPr>
         <w:pStyle w:val="ListBullet"/>
-        <w:spacing w:after="20" w:before="0"/>
+        <w:spacing w:after="20"/>
         <w:ind w:left="432"/>
       </w:pPr>
       <w:r>
@@ -267,13 +253,7 @@
           <w:b/>
           <w:sz w:val="21"/>
         </w:rPr>
-        <w:t>Associate Software Developer</w:t>
-      </w:r>
-      <w:r>
-        <w:rPr>
-          <w:sz w:val="21"/>
-        </w:rPr>
-        <w:t xml:space="preserve"> | TekWorks</w:t>
+        <w:t>Associate Software Developer | TekWorks</w:t>
       </w:r>
     </w:p>
     <w:p>
@@ -291,32 +271,18 @@
     <w:p>
       <w:pPr>
         <w:pStyle w:val="ListBullet"/>
-        <w:spacing w:after="20" w:before="0"/>
+        <w:spacing w:after="20"/>
         <w:ind w:left="432"/>
       </w:pPr>
       <w:r>
         <w:rPr>
           <w:sz w:val="20"/>
         </w:rPr>
-        <w:t>Developed a hospital management system with responsive frontend and REST API backend, reducing patient record lookup time from paper-based process.</w:t>
+        <w:t>Developed a hospital management system with responsive frontend and REST API backend.</w:t>
       </w:r>
     </w:p>
     <w:p>
       <w:pPr>
-        <w:pStyle w:val="ListBullet"/>
-        <w:spacing w:after="20" w:before="0"/>
-        <w:ind w:left="432"/>
-      </w:pPr>
-      <w:r>
-        <w:rPr>
-          <w:sz w:val="20"/>
-        </w:rPr>
-        <w:t>Owned appointment scheduling and billing modules end-to-end, serving administrative staff across multiple departments.</w:t>
-      </w:r>
-    </w:p>
-    <w:p>
-      <w:pPr>
-        <w:keepNext/>
         <w:spacing w:before="200" w:after="60"/>
         <w:pBdr>
           <w:bottom w:val="single" w:sz="4" w:space="1" w:color="1a1a2e"/>
@@ -346,7 +312,7 @@
         <w:rPr>
           <w:sz w:val="20"/>
         </w:rPr>
-        <w:t>Built a live CTI platform with 20+ intelligence surfaces. Correlates indicators across 18 free IOC feeds. Features include ransomware tracking, CVE/KEV feed, Telegram/Reddit/Bluesky aggregation, auto-generated daily briefings, typosquat domain monitoring, and MITRE ATT&amp;CK matrix. Edge-hosted on Cloudflare Workers with STIX 2.1 export. Serves 90+ data sources with zero API keys required.</w:t>
+        <w:t>Live CTI platform with 20+ surfaces correlating indicators across 18 free IOC feeds. Ransomware tracking, CVE/KEV feed, Telegram/Reddit/Bluesky aggregation, auto-generated briefings, domain monitoring. Edge-hosted on Cloudflare. STIX 2.1 export, 90+ data sources, zero API keys.</w:t>
       </w:r>
     </w:p>
     <w:p>
@@ -364,7 +330,7 @@
         <w:rPr>
           <w:sz w:val="20"/>
         </w:rPr>
-        <w:t>Developed 65+ interactive security tools deployed on Cloudflare Workers. IOC checker streams 24 threat intelligence providers over SSE. Includes malware scanner, phishing analyzer, domain/IP/URL/email reputation checks against 19 DNSBLs, CVE lookup with EPSS and KEV scoring, and STIX 2.1 visualizer. All tools run client-side or edge-side with zero server infrastructure.</w:t>
+        <w:t>65+ interactive security tools on Cloudflare Workers. IOC checker streaming 24 providers via SSE. Malware scanner, phishing analyzer, reputation checks against 19 DNSBLs, CVE lookup with EPSS/KEV, STIX 2.1 visualizer. Client-side or edge-side, zero server infrastructure.</w:t>
       </w:r>
     </w:p>
     <w:p>
@@ -382,12 +348,11 @@
         <w:rPr>
           <w:sz w:val="20"/>
         </w:rPr>
-        <w:t>Automated end-to-end domain setup for 1,300+ domains, reducing onboarding time from 4 hours to under 10 minutes per domain. Built Smartlead MCP server integrating 23 analytics tools across 2,700+ monitored inboxes.</w:t>
+        <w:t>Automated domain setup for 1,300+ domains. Reduced onboarding from 4 hours to under 10 minutes per domain. Smartlead MCP server integrating 23 analytics tools across 2,700+ inboxes.</w:t>
       </w:r>
     </w:p>
     <w:p>
       <w:pPr>
-        <w:keepNext/>
         <w:spacing w:before="200" w:after="60"/>
         <w:pBdr>
           <w:bottom w:val="single" w:sz="4" w:space="1" w:color="1a1a2e"/>
@@ -404,7 +369,7 @@
     </w:p>
     <w:p>
       <w:pPr>
-        <w:spacing w:after="20" w:before="0"/>
+        <w:spacing w:after="20"/>
       </w:pPr>
       <w:r>
         <w:rPr>
@@ -422,7 +387,7 @@
     </w:p>
     <w:p>
       <w:pPr>
-        <w:spacing w:after="20" w:before="0"/>
+        <w:spacing w:after="20"/>
       </w:pPr>
       <w:r>
         <w:rPr>
@@ -435,12 +400,12 @@
         <w:rPr>
           <w:sz w:val="20"/>
         </w:rPr>
-        <w:t>IOC enrichment and correlation, MITRE ATT&amp;CK mapping, dark web monitoring, OSINT investigations, threat actor tracking</w:t>
+        <w:t>IOC enrichment and correlation, MITRE ATT&amp;CK mapping, dark web monitoring, OSINT, threat actor tracking</w:t>
       </w:r>
     </w:p>
     <w:p>
       <w:pPr>
-        <w:spacing w:after="20" w:before="0"/>
+        <w:spacing w:after="20"/>
       </w:pPr>
       <w:r>
         <w:rPr>
@@ -453,12 +418,12 @@
         <w:rPr>
           <w:sz w:val="20"/>
         </w:rPr>
-        <w:t>Cloudflare Workers, Hono, React, TypeScript, Python, n8n, MCP, detection engineering, log analysis</w:t>
+        <w:t>Cloudflare Workers, Hono, React, TypeScript, Python, n8n, MCP, detection engineering</w:t>
       </w:r>
     </w:p>
     <w:p>
       <w:pPr>
-        <w:spacing w:after="20" w:before="0"/>
+        <w:spacing w:after="20"/>
       </w:pPr>
       <w:r>
         <w:rPr>
@@ -471,12 +436,12 @@
         <w:rPr>
           <w:sz w:val="20"/>
         </w:rPr>
-        <w:t>IAM, Zero Trust architecture, identity governance, NHI security, GCP, AWS, Azure</w:t>
+        <w:t>IAM, Zero Trust, identity governance, NHI security, GCP, AWS, Azure</w:t>
       </w:r>
     </w:p>
     <w:p>
       <w:pPr>
-        <w:spacing w:after="20" w:before="0"/>
+        <w:spacing w:after="20"/>
       </w:pPr>
       <w:r>
         <w:rPr>
@@ -489,12 +454,11 @@
         <w:rPr>
           <w:sz w:val="20"/>
         </w:rPr>
-        <w:t>Prompt injection testing, MCP attack surface auditing, LLM red teaming, AI agent security</w:t>
+        <w:t>Prompt injection testing, MCP attack surface auditing, LLM red teaming</w:t>
       </w:r>
     </w:p>
     <w:p>
       <w:pPr>
-        <w:keepNext/>
         <w:spacing w:before="200" w:after="60"/>
         <w:pBdr>
           <w:bottom w:val="single" w:sz="4" w:space="1" w:color="1a1a2e"/>
@@ -546,7 +510,23 @@
         <w:pStyle w:val="ListBullet"/>
       </w:pPr>
       <w:r>
-        <w:t>SOCMINT - CyberSudo (2026)</w:t>
+        <w:t>Social Media Intelligence (SOCMINT) - CyberSudo (2026)</w:t>
+      </w:r>
+    </w:p>
+    <w:p>
+      <w:pPr>
+        <w:pStyle w:val="ListBullet"/>
+      </w:pPr>
+      <w:r>
+        <w:t>Cyber Threat Intelligence 101 - arcX (Apr 2025)</w:t>
+      </w:r>
+    </w:p>
+    <w:p>
+      <w:pPr>
+        <w:pStyle w:val="ListBullet"/>
+      </w:pPr>
+      <w:r>
+        <w:t>Antisyphon Training - Antisyphon (2026)</w:t>
       </w:r>
     </w:p>
     <w:p>
@@ -570,22 +550,6 @@
         <w:pStyle w:val="ListBullet"/>
       </w:pPr>
       <w:r>
-        <w:t>Effective AI for Practical SecOps Workflows - ISC2 (2025)</w:t>
-      </w:r>
-    </w:p>
-    <w:p>
-      <w:pPr>
-        <w:pStyle w:val="ListBullet"/>
-      </w:pPr>
-      <w:r>
-        <w:t>Mastering Cyber Threat Intelligence for SOC Analysts - MCSI (2025)</w:t>
-      </w:r>
-    </w:p>
-    <w:p>
-      <w:pPr>
-        <w:pStyle w:val="ListBullet"/>
-      </w:pPr>
-      <w:r>
         <w:t>Data Loss Prevention (DLP) Survival Guide - Fortra (2026)</w:t>
       </w:r>
     </w:p>
@@ -599,7 +563,6 @@
     </w:p>
     <w:p>
       <w:pPr>
-        <w:keepNext/>
         <w:spacing w:before="200" w:after="60"/>
         <w:pBdr>
           <w:bottom w:val="single" w:sz="4" w:space="1" w:color="1a1a2e"/>
@@ -624,14 +587,11 @@
       </w:r>
     </w:p>
     <w:p>
-      <w:pPr>
-        <w:spacing w:after="0"/>
-      </w:pPr>
       <w:r>
         <w:rPr>
           <w:sz w:val="20"/>
         </w:rPr>
-        <w:t>KLEF University</w:t>
+        <w:t>Visvesvaraya Technological University (VTU)</w:t>
       </w:r>
     </w:p>
     <w:sectPr>

</xml_diff>

<commit_message>
resume: condense to a verified single page
- Drop TekWorks role (oldest, least relevant to threat/OSINT).
- Tighten summary, merge UnifyCX bullets, trim Qubit bullets and skills,
  group certs by issuer, collapse education to one line.
- Tighten template spacing.
- Page count verified = 1 via Pages PDF export (not estimated).

Co-Authored-By: Claude Opus 4.8 (1M context) <noreply@anthropic.com>
</commit_message>
<xml_diff>
--- a/public/resume.docx
+++ b/public/resume.docx
@@ -56,7 +56,7 @@
         <w:pBdr>
           <w:bottom w:val="single" w:sz="6" w:space="3" w:color="C9D4E0"/>
         </w:pBdr>
-        <w:spacing w:before="150" w:after="56" w:line="240" w:lineRule="auto"/>
+        <w:spacing w:before="72" w:after="40" w:line="240" w:lineRule="auto"/>
       </w:pPr>
       <w:r>
         <w:rPr>
@@ -71,15 +71,15 @@
     </w:p>
     <w:p>
       <w:pPr>
-        <w:spacing w:before="0" w:after="60" w:line="240" w:lineRule="auto"/>
-      </w:pPr>
-      <w:r>
-        <w:rPr>
-          <w:color w:val="222222"/>
-          <w:sz w:val="20"/>
-          <w:szCs w:val="20"/>
-        </w:rPr>
-        <w:t xml:space="preserve">Threat intelligence analyst with over two years tracking threat actors and running OSINT investigations across a portfolio of 150+ companies. Triaged 250+ phishing, BEC, and malware incidents by pivoting on indicators of compromise and mapping to MITRE ATT&amp;CK, traced 30+ domain-impersonation campaigns via certificate-transparency and dark-web monitoring, and built a public threat-intelligence platform running on 90+ open-source feeds plus an open-source DFIR toolkit.</w:t>
+        <w:spacing w:before="0" w:after="44" w:line="240" w:lineRule="auto"/>
+      </w:pPr>
+      <w:r>
+        <w:rPr>
+          <w:color w:val="222222"/>
+          <w:sz w:val="20"/>
+          <w:szCs w:val="20"/>
+        </w:rPr>
+        <w:t xml:space="preserve">Threat intelligence analyst with over two years tracking threat actors and running OSINT investigations across 150+ companies. Triaged 250+ phishing, BEC, and malware incidents with IOC pivoting and MITRE ATT&amp;CK mapping, traced 30+ domain-impersonation campaigns via certificate-transparency and dark-web monitoring, and built a public CTI platform running on 90+ open-source feeds.</w:t>
       </w:r>
     </w:p>
     <w:p>
@@ -87,7 +87,7 @@
         <w:pBdr>
           <w:bottom w:val="single" w:sz="6" w:space="3" w:color="C9D4E0"/>
         </w:pBdr>
-        <w:spacing w:before="150" w:after="56" w:line="240" w:lineRule="auto"/>
+        <w:spacing w:before="72" w:after="40" w:line="240" w:lineRule="auto"/>
       </w:pPr>
       <w:r>
         <w:rPr>
@@ -102,7 +102,7 @@
     </w:p>
     <w:p>
       <w:pPr>
-        <w:spacing w:before="44" w:after="20" w:line="240" w:lineRule="auto"/>
+        <w:spacing w:before="30" w:after="18" w:line="240" w:lineRule="auto"/>
       </w:pPr>
       <w:r>
         <w:rPr>
@@ -119,7 +119,7 @@
         <w:tabs>
           <w:tab w:val="right" w:pos="10800"/>
         </w:tabs>
-        <w:spacing w:before="0" w:after="60" w:line="240" w:lineRule="auto"/>
+        <w:spacing w:before="0" w:after="44" w:line="240" w:lineRule="auto"/>
       </w:pPr>
       <w:r>
         <w:rPr>
@@ -145,7 +145,7 @@
     </w:p>
     <w:p>
       <w:pPr>
-        <w:spacing w:before="0" w:after="40" w:line="240" w:lineRule="auto"/>
+        <w:spacing w:before="0" w:after="34" w:line="240" w:lineRule="auto"/>
         <w:ind w:left="216" w:hanging="216"/>
       </w:pPr>
       <w:r>
@@ -175,127 +175,127 @@
     </w:p>
     <w:p>
       <w:pPr>
-        <w:spacing w:before="0" w:after="40" w:line="240" w:lineRule="auto"/>
-        <w:ind w:left="216" w:hanging="216"/>
-      </w:pPr>
-      <w:r>
-        <w:rPr>
-          <w:b/>
-          <w:color w:val="2C5F8A"/>
-          <w:sz w:val="18"/>
-          <w:szCs w:val="18"/>
-        </w:rPr>
-        <w:t xml:space="preserve">▪</w:t>
-      </w:r>
-      <w:r>
-        <w:rPr>
-          <w:sz w:val="20"/>
-          <w:szCs w:val="20"/>
-        </w:rPr>
-        <w:t xml:space="preserve">   </w:t>
-      </w:r>
-      <w:r>
-        <w:rPr>
-          <w:color w:val="222222"/>
-          <w:sz w:val="20"/>
-          <w:szCs w:val="20"/>
-        </w:rPr>
-        <w:t xml:space="preserve">Found and took down 30+ lookalike-domain and brand-impersonation campaigns using certificate-transparency monitoring and infrastructure pivoting, cutting the phishing attack surface by about 40% and feeding weekly findings into portfolio-wide risk decisions.</w:t>
-      </w:r>
-    </w:p>
-    <w:p>
-      <w:pPr>
-        <w:spacing w:before="0" w:after="40" w:line="240" w:lineRule="auto"/>
-        <w:ind w:left="216" w:hanging="216"/>
-      </w:pPr>
-      <w:r>
-        <w:rPr>
-          <w:b/>
-          <w:color w:val="2C5F8A"/>
-          <w:sz w:val="18"/>
-          <w:szCs w:val="18"/>
-        </w:rPr>
-        <w:t xml:space="preserve">▪</w:t>
-      </w:r>
-      <w:r>
-        <w:rPr>
-          <w:sz w:val="20"/>
-          <w:szCs w:val="20"/>
-        </w:rPr>
-        <w:t xml:space="preserve">   </w:t>
-      </w:r>
-      <w:r>
-        <w:rPr>
-          <w:color w:val="222222"/>
-          <w:sz w:val="20"/>
-          <w:szCs w:val="20"/>
-        </w:rPr>
-        <w:t xml:space="preserve">Built and run a threat-intelligence platform that tracks day-to-day threat activity (active ransomware groups like LockBit, ALPHV/BlackCat, Play, and Akira, CVE/KEV exposure, and new phishing campaigns) and turns it into weekly briefings that guide remediation priorities across the portfolio.</w:t>
-      </w:r>
-    </w:p>
-    <w:p>
-      <w:pPr>
-        <w:spacing w:before="0" w:after="40" w:line="240" w:lineRule="auto"/>
-        <w:ind w:left="216" w:hanging="216"/>
-      </w:pPr>
-      <w:r>
-        <w:rPr>
-          <w:b/>
-          <w:color w:val="2C5F8A"/>
-          <w:sz w:val="18"/>
-          <w:szCs w:val="18"/>
-        </w:rPr>
-        <w:t xml:space="preserve">▪</w:t>
-      </w:r>
-      <w:r>
-        <w:rPr>
-          <w:sz w:val="20"/>
-          <w:szCs w:val="20"/>
-        </w:rPr>
-        <w:t xml:space="preserve">   </w:t>
-      </w:r>
-      <w:r>
-        <w:rPr>
-          <w:color w:val="222222"/>
-          <w:sz w:val="20"/>
-          <w:szCs w:val="20"/>
-        </w:rPr>
-        <w:t xml:space="preserve">Cut mean response time from 4 hours to under 75 minutes by building automated phishing-triage and enrichment pipelines in n8n, so analysts no longer wait on manual lookups.</w:t>
-      </w:r>
-    </w:p>
-    <w:p>
-      <w:pPr>
-        <w:spacing w:before="0" w:after="40" w:line="240" w:lineRule="auto"/>
-        <w:ind w:left="216" w:hanging="216"/>
-      </w:pPr>
-      <w:r>
-        <w:rPr>
-          <w:b/>
-          <w:color w:val="2C5F8A"/>
-          <w:sz w:val="18"/>
-          <w:szCs w:val="18"/>
-        </w:rPr>
-        <w:t xml:space="preserve">▪</w:t>
-      </w:r>
-      <w:r>
-        <w:rPr>
-          <w:sz w:val="20"/>
-          <w:szCs w:val="20"/>
-        </w:rPr>
-        <w:t xml:space="preserve">   </w:t>
-      </w:r>
-      <w:r>
-        <w:rPr>
-          <w:color w:val="222222"/>
-          <w:sz w:val="20"/>
-          <w:szCs w:val="20"/>
-        </w:rPr>
-        <w:t xml:space="preserve">Refined detection rules to lower the false-positive rate by 25% and per-incident analysis time by 35% (remediation success stayed above 90%), and brought SPF, DKIM, and DMARC alignment to 98%+ across 1,300+ domains, cutting spoofing-based phishing by roughly 60%.</w:t>
-      </w:r>
-    </w:p>
-    <w:p>
-      <w:pPr>
-        <w:spacing w:before="44" w:after="20" w:line="240" w:lineRule="auto"/>
+        <w:spacing w:before="0" w:after="34" w:line="240" w:lineRule="auto"/>
+        <w:ind w:left="216" w:hanging="216"/>
+      </w:pPr>
+      <w:r>
+        <w:rPr>
+          <w:b/>
+          <w:color w:val="2C5F8A"/>
+          <w:sz w:val="18"/>
+          <w:szCs w:val="18"/>
+        </w:rPr>
+        <w:t xml:space="preserve">▪</w:t>
+      </w:r>
+      <w:r>
+        <w:rPr>
+          <w:sz w:val="20"/>
+          <w:szCs w:val="20"/>
+        </w:rPr>
+        <w:t xml:space="preserve">   </w:t>
+      </w:r>
+      <w:r>
+        <w:rPr>
+          <w:color w:val="222222"/>
+          <w:sz w:val="20"/>
+          <w:szCs w:val="20"/>
+        </w:rPr>
+        <w:t xml:space="preserve">Took down 30+ lookalike-domain and brand-impersonation campaigns via certificate-transparency monitoring and infrastructure pivoting, cutting the phishing attack surface by about 40%.</w:t>
+      </w:r>
+    </w:p>
+    <w:p>
+      <w:pPr>
+        <w:spacing w:before="0" w:after="34" w:line="240" w:lineRule="auto"/>
+        <w:ind w:left="216" w:hanging="216"/>
+      </w:pPr>
+      <w:r>
+        <w:rPr>
+          <w:b/>
+          <w:color w:val="2C5F8A"/>
+          <w:sz w:val="18"/>
+          <w:szCs w:val="18"/>
+        </w:rPr>
+        <w:t xml:space="preserve">▪</w:t>
+      </w:r>
+      <w:r>
+        <w:rPr>
+          <w:sz w:val="20"/>
+          <w:szCs w:val="20"/>
+        </w:rPr>
+        <w:t xml:space="preserve">   </w:t>
+      </w:r>
+      <w:r>
+        <w:rPr>
+          <w:color w:val="222222"/>
+          <w:sz w:val="20"/>
+          <w:szCs w:val="20"/>
+        </w:rPr>
+        <w:t xml:space="preserve">Built and run a threat-intelligence platform that tracks day-to-day activity from active ransomware groups (LockBit, ALPHV/BlackCat, Play, Akira), CVE/KEV exposure, and new campaigns, feeding weekly briefings that guide portfolio remediation.</w:t>
+      </w:r>
+    </w:p>
+    <w:p>
+      <w:pPr>
+        <w:spacing w:before="0" w:after="34" w:line="240" w:lineRule="auto"/>
+        <w:ind w:left="216" w:hanging="216"/>
+      </w:pPr>
+      <w:r>
+        <w:rPr>
+          <w:b/>
+          <w:color w:val="2C5F8A"/>
+          <w:sz w:val="18"/>
+          <w:szCs w:val="18"/>
+        </w:rPr>
+        <w:t xml:space="preserve">▪</w:t>
+      </w:r>
+      <w:r>
+        <w:rPr>
+          <w:sz w:val="20"/>
+          <w:szCs w:val="20"/>
+        </w:rPr>
+        <w:t xml:space="preserve">   </w:t>
+      </w:r>
+      <w:r>
+        <w:rPr>
+          <w:color w:val="222222"/>
+          <w:sz w:val="20"/>
+          <w:szCs w:val="20"/>
+        </w:rPr>
+        <w:t xml:space="preserve">Cut mean response time from 4 hours to under 75 minutes with automated phishing-triage and enrichment pipelines built in n8n.</w:t>
+      </w:r>
+    </w:p>
+    <w:p>
+      <w:pPr>
+        <w:spacing w:before="0" w:after="34" w:line="240" w:lineRule="auto"/>
+        <w:ind w:left="216" w:hanging="216"/>
+      </w:pPr>
+      <w:r>
+        <w:rPr>
+          <w:b/>
+          <w:color w:val="2C5F8A"/>
+          <w:sz w:val="18"/>
+          <w:szCs w:val="18"/>
+        </w:rPr>
+        <w:t xml:space="preserve">▪</w:t>
+      </w:r>
+      <w:r>
+        <w:rPr>
+          <w:sz w:val="20"/>
+          <w:szCs w:val="20"/>
+        </w:rPr>
+        <w:t xml:space="preserve">   </w:t>
+      </w:r>
+      <w:r>
+        <w:rPr>
+          <w:color w:val="222222"/>
+          <w:sz w:val="20"/>
+          <w:szCs w:val="20"/>
+        </w:rPr>
+        <w:t xml:space="preserve">Refined detection rules to cut false positives 25% and per-incident analysis time 35%, and brought SPF/DKIM/DMARC alignment to 98%+ across 1,300+ domains, reducing spoofing-based phishing by roughly 60%.</w:t>
+      </w:r>
+    </w:p>
+    <w:p>
+      <w:pPr>
+        <w:spacing w:before="30" w:after="18" w:line="240" w:lineRule="auto"/>
       </w:pPr>
       <w:r>
         <w:rPr>
@@ -312,7 +312,7 @@
         <w:tabs>
           <w:tab w:val="right" w:pos="10800"/>
         </w:tabs>
-        <w:spacing w:before="0" w:after="60" w:line="240" w:lineRule="auto"/>
+        <w:spacing w:before="0" w:after="44" w:line="240" w:lineRule="auto"/>
       </w:pPr>
       <w:r>
         <w:rPr>
@@ -338,135 +338,32 @@
     </w:p>
     <w:p>
       <w:pPr>
-        <w:spacing w:before="0" w:after="40" w:line="240" w:lineRule="auto"/>
-        <w:ind w:left="216" w:hanging="216"/>
-      </w:pPr>
-      <w:r>
-        <w:rPr>
-          <w:b/>
-          <w:color w:val="2C5F8A"/>
-          <w:sz w:val="18"/>
-          <w:szCs w:val="18"/>
-        </w:rPr>
-        <w:t xml:space="preserve">▪</w:t>
-      </w:r>
-      <w:r>
-        <w:rPr>
-          <w:sz w:val="20"/>
-          <w:szCs w:val="20"/>
-        </w:rPr>
-        <w:t xml:space="preserve">   </w:t>
-      </w:r>
-      <w:r>
-        <w:rPr>
-          <w:color w:val="222222"/>
-          <w:sz w:val="20"/>
-          <w:szCs w:val="20"/>
-        </w:rPr>
-        <w:t xml:space="preserve">Investigated and cleaned up 60+ compromised web assets through malware removal, WAF tuning, and XSS fixes, closing 98% on the first pass with no regressions.</w:t>
-      </w:r>
-    </w:p>
-    <w:p>
-      <w:pPr>
-        <w:spacing w:before="0" w:after="40" w:line="240" w:lineRule="auto"/>
-        <w:ind w:left="216" w:hanging="216"/>
-      </w:pPr>
-      <w:r>
-        <w:rPr>
-          <w:b/>
-          <w:color w:val="2C5F8A"/>
-          <w:sz w:val="18"/>
-          <w:szCs w:val="18"/>
-        </w:rPr>
-        <w:t xml:space="preserve">▪</w:t>
-      </w:r>
-      <w:r>
-        <w:rPr>
-          <w:sz w:val="20"/>
-          <w:szCs w:val="20"/>
-        </w:rPr>
-        <w:t xml:space="preserve">   </w:t>
-      </w:r>
-      <w:r>
-        <w:rPr>
-          <w:color w:val="222222"/>
-          <w:sz w:val="20"/>
-          <w:szCs w:val="20"/>
-        </w:rPr>
-        <w:t xml:space="preserve">Cleared IP blacklistings and fixed SPF/DKIM/DMARC misconfigurations for 200+ enterprise domains, restoring inbox placement from 60% to 95% and dropping delivery failures more than 40%.</w:t>
-      </w:r>
-    </w:p>
-    <w:p>
-      <w:pPr>
-        <w:spacing w:before="44" w:after="20" w:line="240" w:lineRule="auto"/>
-      </w:pPr>
-      <w:r>
-        <w:rPr>
-          <w:b/>
-          <w:color w:val="1F3A5F"/>
-          <w:sz w:val="21"/>
-          <w:szCs w:val="21"/>
-        </w:rPr>
-        <w:t xml:space="preserve">Associate Software Developer | TekWorks</w:t>
-      </w:r>
-    </w:p>
-    <w:p>
-      <w:pPr>
-        <w:tabs>
-          <w:tab w:val="right" w:pos="10800"/>
-        </w:tabs>
-        <w:spacing w:before="0" w:after="60" w:line="240" w:lineRule="auto"/>
-      </w:pPr>
-      <w:r>
-        <w:rPr>
-          <w:i/>
-          <w:color w:val="5A6675"/>
-          <w:sz w:val="18"/>
-          <w:szCs w:val="18"/>
-        </w:rPr>
-        <w:t xml:space="preserve">Vijayawada, India</w:t>
-      </w:r>
-      <w:r>
-        <w:tab/>
-      </w:r>
-      <w:r>
-        <w:rPr>
-          <w:i/>
-          <w:color w:val="5A6675"/>
-          <w:sz w:val="18"/>
-          <w:szCs w:val="18"/>
-        </w:rPr>
-        <w:t xml:space="preserve">Mar 2023 - Sep 2023</w:t>
-      </w:r>
-    </w:p>
-    <w:p>
-      <w:pPr>
-        <w:spacing w:before="0" w:after="40" w:line="240" w:lineRule="auto"/>
-        <w:ind w:left="216" w:hanging="216"/>
-      </w:pPr>
-      <w:r>
-        <w:rPr>
-          <w:b/>
-          <w:color w:val="2C5F8A"/>
-          <w:sz w:val="18"/>
-          <w:szCs w:val="18"/>
-        </w:rPr>
-        <w:t xml:space="preserve">▪</w:t>
-      </w:r>
-      <w:r>
-        <w:rPr>
-          <w:sz w:val="20"/>
-          <w:szCs w:val="20"/>
-        </w:rPr>
-        <w:t xml:space="preserve">   </w:t>
-      </w:r>
-      <w:r>
-        <w:rPr>
-          <w:color w:val="222222"/>
-          <w:sz w:val="20"/>
-          <w:szCs w:val="20"/>
-        </w:rPr>
-        <w:t xml:space="preserve">Built a hospital management system with a responsive front end and a REST API backend, replacing years of paper and Excel; owned appointment scheduling and billing end to end.</w:t>
+        <w:spacing w:before="0" w:after="34" w:line="240" w:lineRule="auto"/>
+        <w:ind w:left="216" w:hanging="216"/>
+      </w:pPr>
+      <w:r>
+        <w:rPr>
+          <w:b/>
+          <w:color w:val="2C5F8A"/>
+          <w:sz w:val="18"/>
+          <w:szCs w:val="18"/>
+        </w:rPr>
+        <w:t xml:space="preserve">▪</w:t>
+      </w:r>
+      <w:r>
+        <w:rPr>
+          <w:sz w:val="20"/>
+          <w:szCs w:val="20"/>
+        </w:rPr>
+        <w:t xml:space="preserve">   </w:t>
+      </w:r>
+      <w:r>
+        <w:rPr>
+          <w:color w:val="222222"/>
+          <w:sz w:val="20"/>
+          <w:szCs w:val="20"/>
+        </w:rPr>
+        <w:t xml:space="preserve">Investigated and cleaned up 60+ compromised web assets (malware removal, WAF tuning, XSS fixes) with a 98% first-pass closure, and fixed SPF/DKIM/DMARC and IP-blacklist issues for 200+ enterprise domains, lifting inbox placement from 60% to 95%.</w:t>
       </w:r>
     </w:p>
     <w:p>
@@ -474,7 +371,7 @@
         <w:pBdr>
           <w:bottom w:val="single" w:sz="6" w:space="3" w:color="C9D4E0"/>
         </w:pBdr>
-        <w:spacing w:before="150" w:after="56" w:line="240" w:lineRule="auto"/>
+        <w:spacing w:before="72" w:after="40" w:line="240" w:lineRule="auto"/>
       </w:pPr>
       <w:r>
         <w:rPr>
@@ -489,7 +386,7 @@
     </w:p>
     <w:p>
       <w:pPr>
-        <w:spacing w:before="0" w:after="40" w:line="240" w:lineRule="auto"/>
+        <w:spacing w:before="0" w:after="34" w:line="240" w:lineRule="auto"/>
         <w:ind w:left="216" w:hanging="216"/>
       </w:pPr>
       <w:r>
@@ -523,12 +420,12 @@
           <w:sz w:val="20"/>
           <w:szCs w:val="20"/>
         </w:rPr>
-        <w:t xml:space="preserve"> (pranithjain.qzz.io/threatintel): Live CTI platform with 20+ surfaces that correlate indicators from 90+ open-source feeds: ransomware and negotiation tracking, CVE/KEV intelligence, threat-actor profiles, Telegram/Reddit/Bluesky aggregation, and auto-generated briefings. Exports STIX 2.1, runs on Cloudflare, needs no API keys.</w:t>
-      </w:r>
-    </w:p>
-    <w:p>
-      <w:pPr>
-        <w:spacing w:before="0" w:after="40" w:line="240" w:lineRule="auto"/>
+        <w:t xml:space="preserve"> (pranithjain.qzz.io/threatintel): Live CTI platform, 20+ surfaces correlating indicators from 90+ open-source feeds: ransomware tracking, CVE/KEV intelligence, threat-actor profiles, social-media aggregation, and auto-generated briefings. Exports STIX 2.1, runs on Cloudflare, no API keys.</w:t>
+      </w:r>
+    </w:p>
+    <w:p>
+      <w:pPr>
+        <w:spacing w:before="0" w:after="34" w:line="240" w:lineRule="auto"/>
         <w:ind w:left="216" w:hanging="216"/>
       </w:pPr>
       <w:r>
@@ -562,7 +459,7 @@
           <w:sz w:val="20"/>
           <w:szCs w:val="20"/>
         </w:rPr>
-        <w:t xml:space="preserve"> (pranithjain.qzz.io/dfir · github.com/Pranith-Jain): 65+ interactive security tools on Cloudflare Workers, including an SSE-streaming IOC checker (24 providers), malware scanner, phishing analyzer, reputation checks against 19 DNSBLs, CVE lookup with EPSS/KEV, and a STIX 2.1 visualizer. Also built an MCP server exposing 23 analytics tools across 2,700+ inboxes.</w:t>
+        <w:t xml:space="preserve"> (pranithjain.qzz.io/dfir · github.com/Pranith-Jain): 65+ interactive security tools on Cloudflare Workers: streaming IOC checker (24 providers), malware scanner, phishing analyzer, reputation checks against 19 DNSBLs, CVE lookup with EPSS/KEV, and a STIX 2.1 visualizer. Includes an MCP server with 23 analytics tools across 2,700+ inboxes.</w:t>
       </w:r>
     </w:p>
     <w:p>
@@ -570,7 +467,7 @@
         <w:pBdr>
           <w:bottom w:val="single" w:sz="6" w:space="3" w:color="C9D4E0"/>
         </w:pBdr>
-        <w:spacing w:before="150" w:after="56" w:line="240" w:lineRule="auto"/>
+        <w:spacing w:before="72" w:after="40" w:line="240" w:lineRule="auto"/>
       </w:pPr>
       <w:r>
         <w:rPr>
@@ -585,7 +482,7 @@
     </w:p>
     <w:p>
       <w:pPr>
-        <w:spacing w:before="0" w:after="40" w:line="240" w:lineRule="auto"/>
+        <w:spacing w:before="0" w:after="34" w:line="240" w:lineRule="auto"/>
         <w:ind w:left="216" w:hanging="216"/>
       </w:pPr>
       <w:r>
@@ -619,12 +516,12 @@
           <w:sz w:val="20"/>
           <w:szCs w:val="20"/>
         </w:rPr>
-        <w:t xml:space="preserve"> Cyber threat intelligence (CTI), OSINT investigation, IOC enrichment &amp; correlation, threat-actor tracking, MITRE ATT&amp;CK mapping, threat hunting, dark-web monitoring, certificate-transparency analysis, CVE/KEV prioritization, STIX 2.1 / TAXII</w:t>
-      </w:r>
-    </w:p>
-    <w:p>
-      <w:pPr>
-        <w:spacing w:before="0" w:after="40" w:line="240" w:lineRule="auto"/>
+        <w:t xml:space="preserve"> Cyber threat intelligence (CTI), OSINT, IOC enrichment &amp; correlation, threat-actor tracking, MITRE ATT&amp;CK, threat hunting, dark-web monitoring, CVE/KEV prioritization, STIX 2.1 / TAXII</w:t>
+      </w:r>
+    </w:p>
+    <w:p>
+      <w:pPr>
+        <w:spacing w:before="0" w:after="34" w:line="240" w:lineRule="auto"/>
         <w:ind w:left="216" w:hanging="216"/>
       </w:pPr>
       <w:r>
@@ -663,7 +560,7 @@
     </w:p>
     <w:p>
       <w:pPr>
-        <w:spacing w:before="0" w:after="40" w:line="240" w:lineRule="auto"/>
+        <w:spacing w:before="0" w:after="34" w:line="240" w:lineRule="auto"/>
         <w:ind w:left="216" w:hanging="216"/>
       </w:pPr>
       <w:r>
@@ -702,7 +599,7 @@
     </w:p>
     <w:p>
       <w:pPr>
-        <w:spacing w:before="0" w:after="40" w:line="240" w:lineRule="auto"/>
+        <w:spacing w:before="0" w:after="34" w:line="240" w:lineRule="auto"/>
         <w:ind w:left="216" w:hanging="216"/>
       </w:pPr>
       <w:r>
@@ -741,7 +638,7 @@
     </w:p>
     <w:p>
       <w:pPr>
-        <w:spacing w:before="0" w:after="40" w:line="240" w:lineRule="auto"/>
+        <w:spacing w:before="0" w:after="34" w:line="240" w:lineRule="auto"/>
         <w:ind w:left="216" w:hanging="216"/>
       </w:pPr>
       <w:r>
@@ -780,7 +677,7 @@
     </w:p>
     <w:p>
       <w:pPr>
-        <w:spacing w:before="0" w:after="40" w:line="240" w:lineRule="auto"/>
+        <w:spacing w:before="0" w:after="34" w:line="240" w:lineRule="auto"/>
         <w:ind w:left="216" w:hanging="216"/>
       </w:pPr>
       <w:r>
@@ -822,7 +719,7 @@
         <w:pBdr>
           <w:bottom w:val="single" w:sz="6" w:space="3" w:color="C9D4E0"/>
         </w:pBdr>
-        <w:spacing w:before="150" w:after="56" w:line="240" w:lineRule="auto"/>
+        <w:spacing w:before="72" w:after="40" w:line="240" w:lineRule="auto"/>
       </w:pPr>
       <w:r>
         <w:rPr>
@@ -837,62 +734,62 @@
     </w:p>
     <w:p>
       <w:pPr>
-        <w:spacing w:before="0" w:after="40" w:line="240" w:lineRule="auto"/>
-        <w:ind w:left="216" w:hanging="216"/>
-      </w:pPr>
-      <w:r>
-        <w:rPr>
-          <w:b/>
-          <w:color w:val="2C5F8A"/>
-          <w:sz w:val="18"/>
-          <w:szCs w:val="18"/>
-        </w:rPr>
-        <w:t xml:space="preserve">▪</w:t>
-      </w:r>
-      <w:r>
-        <w:rPr>
-          <w:sz w:val="20"/>
-          <w:szCs w:val="20"/>
-        </w:rPr>
-        <w:t xml:space="preserve">   </w:t>
-      </w:r>
-      <w:r>
-        <w:rPr>
-          <w:color w:val="222222"/>
-          <w:sz w:val="20"/>
-          <w:szCs w:val="20"/>
-        </w:rPr>
-        <w:t xml:space="preserve">Cyber Threat Intelligence 101, arcX (2025) · Social Media Intelligence (SOCMINT), CyberSudo (2026) · Multi-Cloud Blue Team Analyst (MCBTA), CyberWarFare Labs (2025) · Google Cloud Cybersecurity Certificate, Google (2025)</w:t>
-      </w:r>
-    </w:p>
-    <w:p>
-      <w:pPr>
-        <w:spacing w:before="0" w:after="40" w:line="240" w:lineRule="auto"/>
-        <w:ind w:left="216" w:hanging="216"/>
-      </w:pPr>
-      <w:r>
-        <w:rPr>
-          <w:b/>
-          <w:color w:val="2C5F8A"/>
-          <w:sz w:val="18"/>
-          <w:szCs w:val="18"/>
-        </w:rPr>
-        <w:t xml:space="preserve">▪</w:t>
-      </w:r>
-      <w:r>
-        <w:rPr>
-          <w:sz w:val="20"/>
-          <w:szCs w:val="20"/>
-        </w:rPr>
-        <w:t xml:space="preserve">   </w:t>
-      </w:r>
-      <w:r>
-        <w:rPr>
-          <w:color w:val="222222"/>
-          <w:sz w:val="20"/>
-          <w:szCs w:val="20"/>
-        </w:rPr>
-        <w:t xml:space="preserve">Certified Cyber Criminologist (2025) · Certified AI Security Expert (2026), Virtual Cyber Labs · Proofpoint AI Agent Security (2026) · Proofpoint AI Email Security (2025) · DSPM Fundamentals, Securiti AI (2025) · DLP Survival Guide, Antisyphon Training (2026)</w:t>
+        <w:spacing w:before="0" w:after="34" w:line="240" w:lineRule="auto"/>
+        <w:ind w:left="216" w:hanging="216"/>
+      </w:pPr>
+      <w:r>
+        <w:rPr>
+          <w:b/>
+          <w:color w:val="2C5F8A"/>
+          <w:sz w:val="18"/>
+          <w:szCs w:val="18"/>
+        </w:rPr>
+        <w:t xml:space="preserve">▪</w:t>
+      </w:r>
+      <w:r>
+        <w:rPr>
+          <w:sz w:val="20"/>
+          <w:szCs w:val="20"/>
+        </w:rPr>
+        <w:t xml:space="preserve">   </w:t>
+      </w:r>
+      <w:r>
+        <w:rPr>
+          <w:color w:val="222222"/>
+          <w:sz w:val="20"/>
+          <w:szCs w:val="20"/>
+        </w:rPr>
+        <w:t xml:space="preserve">Cyber Threat Intelligence 101, arcX (2025) · SOCMINT, CyberSudo (2026) · Multi-Cloud Blue Team Analyst (MCBTA), CyberWarFare Labs (2025) · Google Cloud Cybersecurity, Google (2025)</w:t>
+      </w:r>
+    </w:p>
+    <w:p>
+      <w:pPr>
+        <w:spacing w:before="0" w:after="34" w:line="240" w:lineRule="auto"/>
+        <w:ind w:left="216" w:hanging="216"/>
+      </w:pPr>
+      <w:r>
+        <w:rPr>
+          <w:b/>
+          <w:color w:val="2C5F8A"/>
+          <w:sz w:val="18"/>
+          <w:szCs w:val="18"/>
+        </w:rPr>
+        <w:t xml:space="preserve">▪</w:t>
+      </w:r>
+      <w:r>
+        <w:rPr>
+          <w:sz w:val="20"/>
+          <w:szCs w:val="20"/>
+        </w:rPr>
+        <w:t xml:space="preserve">   </w:t>
+      </w:r>
+      <w:r>
+        <w:rPr>
+          <w:color w:val="222222"/>
+          <w:sz w:val="20"/>
+          <w:szCs w:val="20"/>
+        </w:rPr>
+        <w:t xml:space="preserve">Certified Cyber Criminologist (2025) &amp; AI Security Expert (2026), Virtual Cyber Labs · Proofpoint AI Agent (2026) &amp; AI Email Security (2025) · DSPM Fundamentals, Securiti AI (2025) · DLP Survival Guide, Antisyphon Training (2026)</w:t>
       </w:r>
     </w:p>
     <w:p>
@@ -900,7 +797,7 @@
         <w:pBdr>
           <w:bottom w:val="single" w:sz="6" w:space="3" w:color="C9D4E0"/>
         </w:pBdr>
-        <w:spacing w:before="150" w:after="56" w:line="240" w:lineRule="auto"/>
+        <w:spacing w:before="72" w:after="40" w:line="240" w:lineRule="auto"/>
       </w:pPr>
       <w:r>
         <w:rPr>
@@ -915,7 +812,7 @@
     </w:p>
     <w:p>
       <w:pPr>
-        <w:spacing w:before="44" w:after="20" w:line="240" w:lineRule="auto"/>
+        <w:spacing w:before="30" w:after="18" w:line="240" w:lineRule="auto"/>
       </w:pPr>
       <w:r>
         <w:rPr>
@@ -926,34 +823,13 @@
         </w:rPr>
         <w:t xml:space="preserve">Bachelor of Engineering, Computer Science</w:t>
       </w:r>
-    </w:p>
-    <w:p>
-      <w:pPr>
-        <w:tabs>
-          <w:tab w:val="right" w:pos="10800"/>
-        </w:tabs>
-        <w:spacing w:before="0" w:after="60" w:line="240" w:lineRule="auto"/>
-      </w:pPr>
-      <w:r>
-        <w:rPr>
-          <w:i/>
-          <w:color w:val="5A6675"/>
-          <w:sz w:val="18"/>
-          <w:szCs w:val="18"/>
-        </w:rPr>
-        <w:t xml:space="preserve">Visvesvaraya Technological University (VTU)</w:t>
-      </w:r>
-      <w:r>
-        <w:tab/>
-      </w:r>
-      <w:r>
-        <w:rPr>
-          <w:i/>
-          <w:color w:val="5A6675"/>
-          <w:sz w:val="18"/>
-          <w:szCs w:val="18"/>
-        </w:rPr>
-        <w:t xml:space="preserve">2019 - Jul 2023</w:t>
+      <w:r>
+        <w:rPr>
+          <w:color w:val="222222"/>
+          <w:sz w:val="21"/>
+          <w:szCs w:val="21"/>
+        </w:rPr>
+        <w:t xml:space="preserve"> | Visvesvaraya Technological University (VTU) | 2019 - Jul 2023</w:t>
       </w:r>
     </w:p>
     <w:sectPr>

</xml_diff>

<commit_message>
resume: correct job titles + add legal entities
- Qubit Capital role: Security Analyst (was Threat Intelligence & Security
  Analyst); add (Sujata Outsourcing).
- UnifyCX role: Tech Associate (was Infrastructure & Email Security Analyst);
  add (GlowTouch Technologies PVT Ltd).

Co-Authored-By: Claude Opus 4.8 (1M context) <noreply@anthropic.com>
</commit_message>
<xml_diff>
--- a/public/resume.docx
+++ b/public/resume.docx
@@ -111,7 +111,7 @@
           <w:sz w:val="21"/>
           <w:szCs w:val="21"/>
         </w:rPr>
-        <w:t xml:space="preserve">Threat Intelligence &amp; Security Analyst | Qubit Capital</w:t>
+        <w:t xml:space="preserve">Security Analyst | Qubit Capital (Sujata Outsourcing)</w:t>
       </w:r>
     </w:p>
     <w:p>
@@ -304,7 +304,7 @@
           <w:sz w:val="21"/>
           <w:szCs w:val="21"/>
         </w:rPr>
-        <w:t xml:space="preserve">Infrastructure &amp; Email Security Analyst | UnifyCX</w:t>
+        <w:t xml:space="preserve">Tech Associate | UnifyCX (GlowTouch Technologies PVT Ltd)</w:t>
       </w:r>
     </w:p>
     <w:p>

</xml_diff>